<commit_message>
Mejora visual tablas TikZ: reducción fuente y renombrado según normas ICFES
- Reducción tamaño fuente en tablas TikZ mediante comando \small
- Mejora presentación visual manteniendo legibilidad completa
- Verificación exitosa compatibilidad 4 formatos: PDF vectorial, HTML, DOCX, Moodle
- Renombrado archivos según normas ICFES: 13.Rmd → probabilidad_intervalos_curva_interpretacion_representacion_n2_v1.Rmd
- Renombrado archivos según normas ICFES: 13-TikZ.Rmd → probabilidad_intervalos_curva_interpretacion_representacion_n2_tikz_v1.Rmd
- Actualización scripts generación: SemilleroUnico_v2.R, SemilleroMoodle_v2.R, SemilleroCloze.R
- Actualización documentación completa: README.md, WALKTHROUGH.md, INDICE_DOCUMENTACION.md
- Generación exitosa tablas PNG (21KB promedio) y PDF vectoriales embebidos
- Documentación técnica: REDUCCION_FUENTE_TABLAS_TIKZ.md, RENOMBRADO_ARCHIVOS_ICFES.md
- Preservación funcionalidad sistema TikZ multi-formato y validaciones robustas
</commit_message>
<xml_diff>
--- a/Lab-Manjaro/13-S1-2024B/salida/pandoc1.docx
+++ b/Lab-Manjaro/13-S1-2024B/salida/pandoc1.docx
@@ -122,7 +122,7 @@
       <w:r>
         <w:drawing>
           <wp:inline>
-            <wp:extent cx="3733800" cy="1309702"/>
+            <wp:extent cx="3733800" cy="1499264"/>
             <wp:effectExtent b="0" l="0" r="0" t="0"/>
             <wp:docPr descr="image" title="" id="24" name="Picture"/>
             <a:graphic>
@@ -143,7 +143,7 @@
                   <pic:spPr bwMode="auto">
                     <a:xfrm>
                       <a:off x="0" y="0"/>
-                      <a:ext cx="3733800" cy="1309702"/>
+                      <a:ext cx="3733800" cy="1499264"/>
                     </a:xfrm>
                     <a:prstGeom prst="rect">
                       <a:avLst/>
@@ -172,14 +172,14 @@
       <w:r>
         <w:drawing>
           <wp:inline>
-            <wp:extent cx="3733800" cy="1309702"/>
+            <wp:extent cx="3733800" cy="1441821"/>
             <wp:effectExtent b="0" l="0" r="0" t="0"/>
             <wp:docPr descr="image" title="" id="27" name="Picture"/>
             <a:graphic>
               <a:graphicData uri="http://schemas.openxmlformats.org/drawingml/2006/picture">
                 <pic:pic>
                   <pic:nvPicPr>
-                    <pic:cNvPr descr="media/supplements1/exercise1/tabla_opcion_c.png" id="28" name="Picture"/>
+                    <pic:cNvPr descr="media/supplements1/exercise1/tabla_opcion_d.png" id="28" name="Picture"/>
                     <pic:cNvPicPr>
                       <a:picLocks noChangeArrowheads="1" noChangeAspect="1"/>
                     </pic:cNvPicPr>
@@ -193,7 +193,7 @@
                   <pic:spPr bwMode="auto">
                     <a:xfrm>
                       <a:off x="0" y="0"/>
-                      <a:ext cx="3733800" cy="1309702"/>
+                      <a:ext cx="3733800" cy="1441821"/>
                     </a:xfrm>
                     <a:prstGeom prst="rect">
                       <a:avLst/>
@@ -222,7 +222,7 @@
       <w:r>
         <w:drawing>
           <wp:inline>
-            <wp:extent cx="3733800" cy="1309702"/>
+            <wp:extent cx="3733800" cy="1441821"/>
             <wp:effectExtent b="0" l="0" r="0" t="0"/>
             <wp:docPr descr="image" title="" id="30" name="Picture"/>
             <a:graphic>
@@ -243,7 +243,7 @@
                   <pic:spPr bwMode="auto">
                     <a:xfrm>
                       <a:off x="0" y="0"/>
-                      <a:ext cx="3733800" cy="1309702"/>
+                      <a:ext cx="3733800" cy="1441821"/>
                     </a:xfrm>
                     <a:prstGeom prst="rect">
                       <a:avLst/>
@@ -272,14 +272,14 @@
       <w:r>
         <w:drawing>
           <wp:inline>
-            <wp:extent cx="3733800" cy="1309702"/>
+            <wp:extent cx="3733800" cy="1441821"/>
             <wp:effectExtent b="0" l="0" r="0" t="0"/>
             <wp:docPr descr="image" title="" id="33" name="Picture"/>
             <a:graphic>
               <a:graphicData uri="http://schemas.openxmlformats.org/drawingml/2006/picture">
                 <pic:pic>
                   <pic:nvPicPr>
-                    <pic:cNvPr descr="media/supplements1/exercise1/tabla_opcion_d.png" id="34" name="Picture"/>
+                    <pic:cNvPr descr="media/supplements1/exercise1/tabla_opcion_c.png" id="34" name="Picture"/>
                     <pic:cNvPicPr>
                       <a:picLocks noChangeArrowheads="1" noChangeAspect="1"/>
                     </pic:cNvPicPr>
@@ -293,7 +293,7 @@
                   <pic:spPr bwMode="auto">
                     <a:xfrm>
                       <a:off x="0" y="0"/>
-                      <a:ext cx="3733800" cy="1309702"/>
+                      <a:ext cx="3733800" cy="1441821"/>
                     </a:xfrm>
                     <a:prstGeom prst="rect">
                       <a:avLst/>
@@ -406,7 +406,7 @@
           <m:t>=</m:t>
         </m:r>
         <m:r>
-          <m:t>5</m:t>
+          <m:t>4</m:t>
         </m:r>
       </m:oMath>
       <w:r>
@@ -420,7 +420,7 @@
           <w:b/>
           <w:bCs/>
         </w:rPr>
-        <w:t xml:space="preserve">0,26</w:t>
+        <w:t xml:space="preserve">0,23</w:t>
       </w:r>
       <w:r>
         <w:t xml:space="preserve">.</w:t>
@@ -450,7 +450,7 @@
           <m:t>=</m:t>
         </m:r>
         <m:r>
-          <m:t>5</m:t>
+          <m:t>4</m:t>
         </m:r>
       </m:oMath>
       <w:r>
@@ -473,7 +473,7 @@
           <m:t>=</m:t>
         </m:r>
         <m:r>
-          <m:t>7</m:t>
+          <m:t>10</m:t>
         </m:r>
       </m:oMath>
       <w:r>
@@ -487,7 +487,7 @@
           <w:b/>
           <w:bCs/>
         </w:rPr>
-        <w:t xml:space="preserve">0,48</w:t>
+        <w:t xml:space="preserve">0,53</w:t>
       </w:r>
       <w:r>
         <w:t xml:space="preserve">.</w:t>
@@ -517,7 +517,7 @@
           <m:t>=</m:t>
         </m:r>
         <m:r>
-          <m:t>7</m:t>
+          <m:t>10</m:t>
         </m:r>
       </m:oMath>
       <w:r>
@@ -554,7 +554,7 @@
           <w:b/>
           <w:bCs/>
         </w:rPr>
-        <w:t xml:space="preserve">0,26</w:t>
+        <w:t xml:space="preserve">0,23</w:t>
       </w:r>
       <w:r>
         <w:t xml:space="preserve">.</w:t>
@@ -635,7 +635,7 @@
           <m:t>≤</m:t>
         </m:r>
         <m:r>
-          <m:t>5</m:t>
+          <m:t>4</m:t>
         </m:r>
       </m:oMath>
     </w:p>
@@ -647,7 +647,7 @@
         </w:numPr>
       </w:pPr>
       <w:r>
-        <w:t xml:space="preserve">0,26</w:t>
+        <w:t xml:space="preserve">0,23</w:t>
       </w:r>
     </w:p>
     <w:p>
@@ -659,7 +659,7 @@
       </w:pPr>
       <m:oMath>
         <m:r>
-          <m:t>5</m:t>
+          <m:t>4</m:t>
         </m:r>
         <m:r>
           <m:rPr>
@@ -677,7 +677,7 @@
           <m:t>≤</m:t>
         </m:r>
         <m:r>
-          <m:t>7</m:t>
+          <m:t>10</m:t>
         </m:r>
       </m:oMath>
     </w:p>
@@ -689,7 +689,7 @@
         </w:numPr>
       </w:pPr>
       <w:r>
-        <w:t xml:space="preserve">0,48</w:t>
+        <w:t xml:space="preserve">0,53</w:t>
       </w:r>
     </w:p>
     <w:p>
@@ -701,7 +701,7 @@
       </w:pPr>
       <m:oMath>
         <m:r>
-          <m:t>7</m:t>
+          <m:t>10</m:t>
         </m:r>
         <m:r>
           <m:rPr>
@@ -731,7 +731,7 @@
         </w:numPr>
       </w:pPr>
       <w:r>
-        <w:t xml:space="preserve">0,26</w:t>
+        <w:t xml:space="preserve">0,23</w:t>
       </w:r>
     </w:p>
     <w:p>
@@ -778,7 +778,7 @@
         <w:t xml:space="preserve"> </w:t>
       </w:r>
       <w:r>
-        <w:t xml:space="preserve">Una de las tablas muestra cómo la probabilidad se va sumando (0,26, 0,74, 1,00), lo cual es una interpretación incorrecta del gráfico.</w:t>
+        <w:t xml:space="preserve">Una de las tablas muestra cómo la probabilidad se va sumando (0,23, 0,76, 1,00), lo cual es una interpretación incorrecta del gráfico.</w:t>
       </w:r>
     </w:p>
     <w:p>
@@ -824,7 +824,7 @@
           <m:t>≤</m:t>
         </m:r>
         <m:r>
-          <m:t>7</m:t>
+          <m:t>10</m:t>
         </m:r>
       </m:oMath>
       <w:r>
@@ -984,7 +984,7 @@
         </w:numPr>
       </w:pPr>
       <w:r>
-        <w:t xml:space="preserve">Incorrecto. Intercambia los valores asignando el central a los laterales.</w:t>
+        <w:t xml:space="preserve">Incorrecto. No coincide con la asignación de probabilidades del gráfico.</w:t>
       </w:r>
     </w:p>
     <w:p>
@@ -1006,7 +1006,7 @@
         </w:numPr>
       </w:pPr>
       <w:r>
-        <w:t xml:space="preserve">Incorrecto. No coincide con la asignación de probabilidades del gráfico.</w:t>
+        <w:t xml:space="preserve">Incorrecto. Intercambia los valores asignando el central a los laterales.</w:t>
       </w:r>
     </w:p>
     <w:sectPr/>

</xml_diff>

<commit_message>
Verificación exitosa configuración extrema TikZ Moodle: reducción 19% tamaño fuente
- Implementada configuración extrema basada en Pedorros4.Rmd (\fontsize{4pt}{5pt}\selectfont + scale=0.5)
- Verificada compatibilidad completa con formato Moodle (moodlequiz.xml generado correctamente)
- Confirmada reducción 19% en tamaños PNG: de ~21KB a ~17KB promedio
- Solucionado conflicto parámetros width entre TikZ y include_tikz() (8cm → 3cm)
- Unificadas todas las tablas (opciones A-D + solución) con función generar_tabla_tikz()
- Agregadas validaciones robustas para prevenir errores de compilación
- Documentación completa en VERIFICACION_MOODLE_CONFIGURACION_EXTREMA.md
- Archivos: probabilidad_intervalos_curva_interpretacion_representacion_n2_tikz_v1.Rmd, documentación MD
</commit_message>
<xml_diff>
--- a/Lab-Manjaro/13-S1-2024B/salida/pandoc1.docx
+++ b/Lab-Manjaro/13-S1-2024B/salida/pandoc1.docx
@@ -122,14 +122,14 @@
       <w:r>
         <w:drawing>
           <wp:inline>
-            <wp:extent cx="3733800" cy="1499264"/>
+            <wp:extent cx="2133600" cy="613820"/>
             <wp:effectExtent b="0" l="0" r="0" t="0"/>
             <wp:docPr descr="image" title="" id="24" name="Picture"/>
             <a:graphic>
               <a:graphicData uri="http://schemas.openxmlformats.org/drawingml/2006/picture">
                 <pic:pic>
                   <pic:nvPicPr>
-                    <pic:cNvPr descr="media/supplements1/exercise1/tabla_opcion_b.png" id="25" name="Picture"/>
+                    <pic:cNvPr descr="media/supplements1/exercise1/tabla_opcion_c.png" id="25" name="Picture"/>
                     <pic:cNvPicPr>
                       <a:picLocks noChangeArrowheads="1" noChangeAspect="1"/>
                     </pic:cNvPicPr>
@@ -143,7 +143,7 @@
                   <pic:spPr bwMode="auto">
                     <a:xfrm>
                       <a:off x="0" y="0"/>
-                      <a:ext cx="3733800" cy="1499264"/>
+                      <a:ext cx="2133600" cy="613820"/>
                     </a:xfrm>
                     <a:prstGeom prst="rect">
                       <a:avLst/>
@@ -172,14 +172,14 @@
       <w:r>
         <w:drawing>
           <wp:inline>
-            <wp:extent cx="3733800" cy="1441821"/>
+            <wp:extent cx="2133600" cy="613820"/>
             <wp:effectExtent b="0" l="0" r="0" t="0"/>
             <wp:docPr descr="image" title="" id="27" name="Picture"/>
             <a:graphic>
               <a:graphicData uri="http://schemas.openxmlformats.org/drawingml/2006/picture">
                 <pic:pic>
                   <pic:nvPicPr>
-                    <pic:cNvPr descr="media/supplements1/exercise1/tabla_opcion_d.png" id="28" name="Picture"/>
+                    <pic:cNvPr descr="media/supplements1/exercise1/tabla_opcion_b.png" id="28" name="Picture"/>
                     <pic:cNvPicPr>
                       <a:picLocks noChangeArrowheads="1" noChangeAspect="1"/>
                     </pic:cNvPicPr>
@@ -193,7 +193,7 @@
                   <pic:spPr bwMode="auto">
                     <a:xfrm>
                       <a:off x="0" y="0"/>
-                      <a:ext cx="3733800" cy="1441821"/>
+                      <a:ext cx="2133600" cy="613820"/>
                     </a:xfrm>
                     <a:prstGeom prst="rect">
                       <a:avLst/>
@@ -222,7 +222,7 @@
       <w:r>
         <w:drawing>
           <wp:inline>
-            <wp:extent cx="3733800" cy="1441821"/>
+            <wp:extent cx="2133600" cy="613820"/>
             <wp:effectExtent b="0" l="0" r="0" t="0"/>
             <wp:docPr descr="image" title="" id="30" name="Picture"/>
             <a:graphic>
@@ -243,7 +243,7 @@
                   <pic:spPr bwMode="auto">
                     <a:xfrm>
                       <a:off x="0" y="0"/>
-                      <a:ext cx="3733800" cy="1441821"/>
+                      <a:ext cx="2133600" cy="613820"/>
                     </a:xfrm>
                     <a:prstGeom prst="rect">
                       <a:avLst/>
@@ -272,14 +272,14 @@
       <w:r>
         <w:drawing>
           <wp:inline>
-            <wp:extent cx="3733800" cy="1441821"/>
+            <wp:extent cx="2133600" cy="613820"/>
             <wp:effectExtent b="0" l="0" r="0" t="0"/>
             <wp:docPr descr="image" title="" id="33" name="Picture"/>
             <a:graphic>
               <a:graphicData uri="http://schemas.openxmlformats.org/drawingml/2006/picture">
                 <pic:pic>
                   <pic:nvPicPr>
-                    <pic:cNvPr descr="media/supplements1/exercise1/tabla_opcion_c.png" id="34" name="Picture"/>
+                    <pic:cNvPr descr="media/supplements1/exercise1/tabla_opcion_d.png" id="34" name="Picture"/>
                     <pic:cNvPicPr>
                       <a:picLocks noChangeArrowheads="1" noChangeAspect="1"/>
                     </pic:cNvPicPr>
@@ -293,7 +293,7 @@
                   <pic:spPr bwMode="auto">
                     <a:xfrm>
                       <a:off x="0" y="0"/>
-                      <a:ext cx="3733800" cy="1441821"/>
+                      <a:ext cx="2133600" cy="613820"/>
                     </a:xfrm>
                     <a:prstGeom prst="rect">
                       <a:avLst/>
@@ -420,7 +420,7 @@
           <w:b/>
           <w:bCs/>
         </w:rPr>
-        <w:t xml:space="preserve">0,23</w:t>
+        <w:t xml:space="preserve">0,26</w:t>
       </w:r>
       <w:r>
         <w:t xml:space="preserve">.</w:t>
@@ -473,7 +473,7 @@
           <m:t>=</m:t>
         </m:r>
         <m:r>
-          <m:t>10</m:t>
+          <m:t>7</m:t>
         </m:r>
       </m:oMath>
       <w:r>
@@ -487,7 +487,7 @@
           <w:b/>
           <w:bCs/>
         </w:rPr>
-        <w:t xml:space="preserve">0,53</w:t>
+        <w:t xml:space="preserve">0,48</w:t>
       </w:r>
       <w:r>
         <w:t xml:space="preserve">.</w:t>
@@ -517,7 +517,7 @@
           <m:t>=</m:t>
         </m:r>
         <m:r>
-          <m:t>10</m:t>
+          <m:t>7</m:t>
         </m:r>
       </m:oMath>
       <w:r>
@@ -554,7 +554,7 @@
           <w:b/>
           <w:bCs/>
         </w:rPr>
-        <w:t xml:space="preserve">0,23</w:t>
+        <w:t xml:space="preserve">0,26</w:t>
       </w:r>
       <w:r>
         <w:t xml:space="preserve">.</w:t>
@@ -594,144 +594,46 @@
         </w:numPr>
       </w:pPr>
       <w:r>
-        <w:t xml:space="preserve">Intervalo</w:t>
-      </w:r>
-    </w:p>
-    <w:p>
-      <w:pPr>
-        <w:numPr>
-          <w:ilvl w:val="0"/>
-          <w:numId w:val="1000"/>
-        </w:numPr>
-      </w:pPr>
-      <w:r>
-        <w:t xml:space="preserve">Probabilidad</w:t>
-      </w:r>
-    </w:p>
-    <w:p>
-      <w:pPr>
-        <w:numPr>
-          <w:ilvl w:val="0"/>
-          <w:numId w:val="1000"/>
-        </w:numPr>
-      </w:pPr>
-      <m:oMath>
-        <m:r>
-          <m:t>0</m:t>
-        </m:r>
-        <m:r>
-          <m:rPr>
-            <m:sty m:val="p"/>
-          </m:rPr>
-          <m:t>≤</m:t>
-        </m:r>
-        <m:r>
-          <m:t>x</m:t>
-        </m:r>
-        <m:r>
-          <m:rPr>
-            <m:sty m:val="p"/>
-          </m:rPr>
-          <m:t>≤</m:t>
-        </m:r>
-        <m:r>
-          <m:t>4</m:t>
-        </m:r>
-      </m:oMath>
-    </w:p>
-    <w:p>
-      <w:pPr>
-        <w:numPr>
-          <w:ilvl w:val="0"/>
-          <w:numId w:val="1000"/>
-        </w:numPr>
-      </w:pPr>
-      <w:r>
-        <w:t xml:space="preserve">0,23</w:t>
-      </w:r>
-    </w:p>
-    <w:p>
-      <w:pPr>
-        <w:numPr>
-          <w:ilvl w:val="0"/>
-          <w:numId w:val="1000"/>
-        </w:numPr>
-      </w:pPr>
-      <m:oMath>
-        <m:r>
-          <m:t>4</m:t>
-        </m:r>
-        <m:r>
-          <m:rPr>
-            <m:sty m:val="p"/>
-          </m:rPr>
-          <m:t>&lt;</m:t>
-        </m:r>
-        <m:r>
-          <m:t>x</m:t>
-        </m:r>
-        <m:r>
-          <m:rPr>
-            <m:sty m:val="p"/>
-          </m:rPr>
-          <m:t>≤</m:t>
-        </m:r>
-        <m:r>
-          <m:t>10</m:t>
-        </m:r>
-      </m:oMath>
-    </w:p>
-    <w:p>
-      <w:pPr>
-        <w:numPr>
-          <w:ilvl w:val="0"/>
-          <w:numId w:val="1000"/>
-        </w:numPr>
-      </w:pPr>
-      <w:r>
-        <w:t xml:space="preserve">0,53</w:t>
-      </w:r>
-    </w:p>
-    <w:p>
-      <w:pPr>
-        <w:numPr>
-          <w:ilvl w:val="0"/>
-          <w:numId w:val="1000"/>
-        </w:numPr>
-      </w:pPr>
-      <m:oMath>
-        <m:r>
-          <m:t>10</m:t>
-        </m:r>
-        <m:r>
-          <m:rPr>
-            <m:sty m:val="p"/>
-          </m:rPr>
-          <m:t>&lt;</m:t>
-        </m:r>
-        <m:r>
-          <m:t>x</m:t>
-        </m:r>
-        <m:r>
-          <m:rPr>
-            <m:sty m:val="p"/>
-          </m:rPr>
-          <m:t>≤</m:t>
-        </m:r>
-        <m:r>
-          <m:t>14</m:t>
-        </m:r>
-      </m:oMath>
-    </w:p>
-    <w:p>
-      <w:pPr>
-        <w:numPr>
-          <w:ilvl w:val="0"/>
-          <w:numId w:val="1000"/>
-        </w:numPr>
-      </w:pPr>
-      <w:r>
-        <w:t xml:space="preserve">0,23</w:t>
+        <w:drawing>
+          <wp:inline>
+            <wp:extent cx="1079999" cy="315692"/>
+            <wp:effectExtent b="0" l="0" r="0" t="0"/>
+            <wp:docPr descr="image" title="" id="36" name="Picture"/>
+            <a:graphic>
+              <a:graphicData uri="http://schemas.openxmlformats.org/drawingml/2006/picture">
+                <pic:pic>
+                  <pic:nvPicPr>
+                    <pic:cNvPr descr="media/supplements1/exercise1/tabla_solucion.png" id="37" name="Picture"/>
+                    <pic:cNvPicPr>
+                      <a:picLocks noChangeArrowheads="1" noChangeAspect="1"/>
+                    </pic:cNvPicPr>
+                  </pic:nvPicPr>
+                  <pic:blipFill>
+                    <a:blip r:embed="rId35"/>
+                    <a:stretch>
+                      <a:fillRect/>
+                    </a:stretch>
+                  </pic:blipFill>
+                  <pic:spPr bwMode="auto">
+                    <a:xfrm>
+                      <a:off x="0" y="0"/>
+                      <a:ext cx="1079999" cy="315692"/>
+                    </a:xfrm>
+                    <a:prstGeom prst="rect">
+                      <a:avLst/>
+                    </a:prstGeom>
+                    <a:noFill/>
+                    <a:ln w="9525">
+                      <a:noFill/>
+                      <a:headEnd/>
+                      <a:tailEnd/>
+                    </a:ln>
+                  </pic:spPr>
+                </pic:pic>
+              </a:graphicData>
+            </a:graphic>
+          </wp:inline>
+        </w:drawing>
       </w:r>
     </w:p>
     <w:p>
@@ -778,7 +680,7 @@
         <w:t xml:space="preserve"> </w:t>
       </w:r>
       <w:r>
-        <w:t xml:space="preserve">Una de las tablas muestra cómo la probabilidad se va sumando (0,23, 0,76, 1,00), lo cual es una interpretación incorrecta del gráfico.</w:t>
+        <w:t xml:space="preserve">Una de las tablas muestra cómo la probabilidad se va sumando (0,26, 0,74, 1,00), lo cual es una interpretación incorrecta del gráfico.</w:t>
       </w:r>
     </w:p>
     <w:p>
@@ -824,7 +726,7 @@
           <m:t>≤</m:t>
         </m:r>
         <m:r>
-          <m:t>10</m:t>
+          <m:t>7</m:t>
         </m:r>
       </m:oMath>
       <w:r>
@@ -871,6 +773,17 @@
         </w:numPr>
       </w:pPr>
       <w:r>
+        <w:t xml:space="preserve">Incorrecto. Intercambia los valores asignando el central a los laterales.</w:t>
+      </w:r>
+    </w:p>
+    <w:p>
+      <w:pPr>
+        <w:numPr>
+          <w:ilvl w:val="1"/>
+          <w:numId w:val="1005"/>
+        </w:numPr>
+      </w:pPr>
+      <w:r>
         <w:t xml:space="preserve">Incorrecto. Usa intervalos acumulativos (0</w:t>
       </w:r>
       <w:r>
@@ -984,7 +897,7 @@
         </w:numPr>
       </w:pPr>
       <w:r>
-        <w:t xml:space="preserve">Incorrecto. No coincide con la asignación de probabilidades del gráfico.</w:t>
+        <w:t xml:space="preserve">Correcto. Esta tabla representa exactamente los tres intervalos y sus probabilidades correspondientes como se muestra en el gráfico.</w:t>
       </w:r>
     </w:p>
     <w:p>
@@ -995,18 +908,7 @@
         </w:numPr>
       </w:pPr>
       <w:r>
-        <w:t xml:space="preserve">Correcto. Esta tabla representa exactamente los tres intervalos y sus probabilidades correspondientes como se muestra en el gráfico.</w:t>
-      </w:r>
-    </w:p>
-    <w:p>
-      <w:pPr>
-        <w:numPr>
-          <w:ilvl w:val="1"/>
-          <w:numId w:val="1005"/>
-        </w:numPr>
-      </w:pPr>
-      <w:r>
-        <w:t xml:space="preserve">Incorrecto. Intercambia los valores asignando el central a los laterales.</w:t>
+        <w:t xml:space="preserve">Incorrecto. No coincide con la asignación de probabilidades del gráfico.</w:t>
       </w:r>
     </w:p>
     <w:sectPr/>

</xml_diff>